<commit_message>
Expande documentacao tecnica com versao detalhada em README PDF e DOCX
Co-authored-by: André Hangalo <hangaloandre@gmail.com>
</commit_message>
<xml_diff>
--- a/docs/Documentacao_Engenharia_Software.docx
+++ b/docs/Documentacao_Engenharia_Software.docx
@@ -12,12 +12,12 @@
     </w:p>
     <w:p>
       <w:r>
-        <w:t>Plataforma Multimodal para Avaliacao e Pitch Automatizado de Startups</w:t>
+        <w:t>StartupScan - versao completa e detalhada</w:t>
       </w:r>
     </w:p>
     <w:p>
       <w:r>
-        <w:t>Gerado em: 23/03/2026 05:23</w:t>
+        <w:t>Gerado em: 23/03/2026 05:28</w:t>
       </w:r>
     </w:p>
     <w:p>
@@ -25,12 +25,44 @@
         <w:pStyle w:val="Heading1"/>
       </w:pPr>
       <w:r>
-        <w:t>1. Objetivo do sistema</w:t>
+        <w:t>1. Resumo e objetivos</w:t>
       </w:r>
     </w:p>
     <w:p>
       <w:r>
-        <w:t>A plataforma automatiza a avaliacao de startups com entrada multimodal, score de potencial, relatorios tecnicos, video explicativo e pitch deck visual.</w:t>
+        <w:t>O StartupScan e uma plataforma para avaliacao de startups com IA, projetada para reduzir tempo de analise, aumentar padronizacao do feedback e produzir artefatos executivos para tomada de decisao.</w:t>
+      </w:r>
+    </w:p>
+    <w:p>
+      <w:pPr>
+        <w:pStyle w:val="ListBullet"/>
+      </w:pPr>
+      <w:r>
+        <w:t>Receber pitch em formato multimodal.</w:t>
+      </w:r>
+    </w:p>
+    <w:p>
+      <w:pPr>
+        <w:pStyle w:val="ListBullet"/>
+      </w:pPr>
+      <w:r>
+        <w:t>Gerar score e recomendacoes interpretaveis.</w:t>
+      </w:r>
+    </w:p>
+    <w:p>
+      <w:pPr>
+        <w:pStyle w:val="ListBullet"/>
+      </w:pPr>
+      <w:r>
+        <w:t>Entregar relatorio tecnico, video IA e pitch deck visual.</w:t>
+      </w:r>
+    </w:p>
+    <w:p>
+      <w:pPr>
+        <w:pStyle w:val="ListBullet"/>
+      </w:pPr>
+      <w:r>
+        <w:t>Suportar operacao continua com monitoramento de jobs.</w:t>
       </w:r>
     </w:p>
     <w:p>
@@ -38,7 +70,7 @@
         <w:pStyle w:val="Heading1"/>
       </w:pPr>
       <w:r>
-        <w:t>2. Funcionalidades implementadas</w:t>
+        <w:t>2. Escopo funcional implementado</w:t>
       </w:r>
     </w:p>
     <w:p>
@@ -115,9 +147,245 @@
     </w:p>
     <w:p>
       <w:r>
-        <w:t>A solucao utiliza Django + DRF no backend, templates responsivos no frontend, pipeline de IA para analise multimodal e servicos de exportacao de documentos.</w:t>
+        <w:t>A solucao utiliza arquitetura modular com servicos especializados para analise, video e exportacao.</w:t>
       </w:r>
     </w:p>
+    <w:tbl>
+      <w:tblPr>
+        <w:tblStyle w:val="LightList-Accent1"/>
+        <w:tblW w:type="auto" w:w="0"/>
+        <w:tblLook w:firstColumn="1" w:firstRow="1" w:lastColumn="0" w:lastRow="0" w:noHBand="0" w:noVBand="1" w:val="04A0"/>
+      </w:tblPr>
+      <w:tblGrid>
+        <w:gridCol w:w="2880"/>
+        <w:gridCol w:w="2880"/>
+        <w:gridCol w:w="2880"/>
+      </w:tblGrid>
+      <w:tr>
+        <w:tc>
+          <w:tcPr>
+            <w:tcW w:type="dxa" w:w="2880"/>
+          </w:tcPr>
+          <w:p>
+            <w:r>
+              <w:t>Camada</w:t>
+            </w:r>
+          </w:p>
+        </w:tc>
+        <w:tc>
+          <w:tcPr>
+            <w:tcW w:type="dxa" w:w="2880"/>
+          </w:tcPr>
+          <w:p>
+            <w:r>
+              <w:t>Tecnologia</w:t>
+            </w:r>
+          </w:p>
+        </w:tc>
+        <w:tc>
+          <w:tcPr>
+            <w:tcW w:type="dxa" w:w="2880"/>
+          </w:tcPr>
+          <w:p>
+            <w:r>
+              <w:t>Responsabilidade</w:t>
+            </w:r>
+          </w:p>
+        </w:tc>
+      </w:tr>
+      <w:tr>
+        <w:tc>
+          <w:tcPr>
+            <w:tcW w:type="dxa" w:w="2880"/>
+          </w:tcPr>
+          <w:p>
+            <w:r>
+              <w:t>Frontend</w:t>
+            </w:r>
+          </w:p>
+        </w:tc>
+        <w:tc>
+          <w:tcPr>
+            <w:tcW w:type="dxa" w:w="2880"/>
+          </w:tcPr>
+          <w:p>
+            <w:r>
+              <w:t>Django Templates + JS</w:t>
+            </w:r>
+          </w:p>
+        </w:tc>
+        <w:tc>
+          <w:tcPr>
+            <w:tcW w:type="dxa" w:w="2880"/>
+          </w:tcPr>
+          <w:p>
+            <w:r>
+              <w:t>Interface, formularios, dashboards e polling de progresso</w:t>
+            </w:r>
+          </w:p>
+        </w:tc>
+      </w:tr>
+      <w:tr>
+        <w:tc>
+          <w:tcPr>
+            <w:tcW w:type="dxa" w:w="2880"/>
+          </w:tcPr>
+          <w:p>
+            <w:r>
+              <w:t>Backend</w:t>
+            </w:r>
+          </w:p>
+        </w:tc>
+        <w:tc>
+          <w:tcPr>
+            <w:tcW w:type="dxa" w:w="2880"/>
+          </w:tcPr>
+          <w:p>
+            <w:r>
+              <w:t>Django + DRF</w:t>
+            </w:r>
+          </w:p>
+        </w:tc>
+        <w:tc>
+          <w:tcPr>
+            <w:tcW w:type="dxa" w:w="2880"/>
+          </w:tcPr>
+          <w:p>
+            <w:r>
+              <w:t>Orquestracao, regras de negocio, rotas e seguranca</w:t>
+            </w:r>
+          </w:p>
+        </w:tc>
+      </w:tr>
+      <w:tr>
+        <w:tc>
+          <w:tcPr>
+            <w:tcW w:type="dxa" w:w="2880"/>
+          </w:tcPr>
+          <w:p>
+            <w:r>
+              <w:t>IA</w:t>
+            </w:r>
+          </w:p>
+        </w:tc>
+        <w:tc>
+          <w:tcPr>
+            <w:tcW w:type="dxa" w:w="2880"/>
+          </w:tcPr>
+          <w:p>
+            <w:r>
+              <w:t>scikit-learn + OpenAI</w:t>
+            </w:r>
+          </w:p>
+        </w:tc>
+        <w:tc>
+          <w:tcPr>
+            <w:tcW w:type="dxa" w:w="2880"/>
+          </w:tcPr>
+          <w:p>
+            <w:r>
+              <w:t>Scoring, interpretabilidade e narrativa</w:t>
+            </w:r>
+          </w:p>
+        </w:tc>
+      </w:tr>
+      <w:tr>
+        <w:tc>
+          <w:tcPr>
+            <w:tcW w:type="dxa" w:w="2880"/>
+          </w:tcPr>
+          <w:p>
+            <w:r>
+              <w:t>Video</w:t>
+            </w:r>
+          </w:p>
+        </w:tc>
+        <w:tc>
+          <w:tcPr>
+            <w:tcW w:type="dxa" w:w="2880"/>
+          </w:tcPr>
+          <w:p>
+            <w:r>
+              <w:t>moviepy + D-ID</w:t>
+            </w:r>
+          </w:p>
+        </w:tc>
+        <w:tc>
+          <w:tcPr>
+            <w:tcW w:type="dxa" w:w="2880"/>
+          </w:tcPr>
+          <w:p>
+            <w:r>
+              <w:t>Geracao de video IA e renderizacao local</w:t>
+            </w:r>
+          </w:p>
+        </w:tc>
+      </w:tr>
+      <w:tr>
+        <w:tc>
+          <w:tcPr>
+            <w:tcW w:type="dxa" w:w="2880"/>
+          </w:tcPr>
+          <w:p>
+            <w:r>
+              <w:t>Documentacao</w:t>
+            </w:r>
+          </w:p>
+        </w:tc>
+        <w:tc>
+          <w:tcPr>
+            <w:tcW w:type="dxa" w:w="2880"/>
+          </w:tcPr>
+          <w:p>
+            <w:r>
+              <w:t>reportlab + python-docx</w:t>
+            </w:r>
+          </w:p>
+        </w:tc>
+        <w:tc>
+          <w:tcPr>
+            <w:tcW w:type="dxa" w:w="2880"/>
+          </w:tcPr>
+          <w:p>
+            <w:r>
+              <w:t>Exportacao PDF e DOCX</w:t>
+            </w:r>
+          </w:p>
+        </w:tc>
+      </w:tr>
+      <w:tr>
+        <w:tc>
+          <w:tcPr>
+            <w:tcW w:type="dxa" w:w="2880"/>
+          </w:tcPr>
+          <w:p>
+            <w:r>
+              <w:t>Persistencia</w:t>
+            </w:r>
+          </w:p>
+        </w:tc>
+        <w:tc>
+          <w:tcPr>
+            <w:tcW w:type="dxa" w:w="2880"/>
+          </w:tcPr>
+          <w:p>
+            <w:r>
+              <w:t>SQLite/PostgreSQL</w:t>
+            </w:r>
+          </w:p>
+        </w:tc>
+        <w:tc>
+          <w:tcPr>
+            <w:tcW w:type="dxa" w:w="2880"/>
+          </w:tcPr>
+          <w:p>
+            <w:r>
+              <w:t>Analises, submissoes e metadata operacional</w:t>
+            </w:r>
+          </w:p>
+        </w:tc>
+      </w:tr>
+    </w:tbl>
     <w:p>
       <w:r>
         <w:t>Diagrama de arquitetura:</w:t>
@@ -127,7 +395,7 @@
       <w:r>
         <w:drawing>
           <wp:inline xmlns:a="http://schemas.openxmlformats.org/drawingml/2006/main" xmlns:pic="http://schemas.openxmlformats.org/drawingml/2006/picture">
-            <wp:extent cx="5852160" cy="2128058"/>
+            <wp:extent cx="5852160" cy="2145792"/>
             <wp:docPr id="1" name="Picture 1"/>
             <wp:cNvGraphicFramePr>
               <a:graphicFrameLocks noChangeAspect="1"/>
@@ -148,7 +416,7 @@
                   <pic:spPr>
                     <a:xfrm>
                       <a:off x="0" y="0"/>
-                      <a:ext cx="5852160" cy="2128058"/>
+                      <a:ext cx="5852160" cy="2145792"/>
                     </a:xfrm>
                     <a:prstGeom prst="rect"/>
                   </pic:spPr>
@@ -168,7 +436,7 @@
       <w:r>
         <w:drawing>
           <wp:inline xmlns:a="http://schemas.openxmlformats.org/drawingml/2006/main" xmlns:pic="http://schemas.openxmlformats.org/drawingml/2006/picture">
-            <wp:extent cx="5852160" cy="2926080"/>
+            <wp:extent cx="5852160" cy="2660073"/>
             <wp:docPr id="2" name="Picture 2"/>
             <wp:cNvGraphicFramePr>
               <a:graphicFrameLocks noChangeAspect="1"/>
@@ -189,7 +457,7 @@
                   <pic:spPr>
                     <a:xfrm>
                       <a:off x="0" y="0"/>
-                      <a:ext cx="5852160" cy="2926080"/>
+                      <a:ext cx="5852160" cy="2660073"/>
                     </a:xfrm>
                     <a:prstGeom prst="rect"/>
                   </pic:spPr>
@@ -242,11 +510,487 @@
       </w:r>
     </w:p>
     <w:p>
+      <w:r>
+        <w:t>Fases de jobs assincromos:</w:t>
+      </w:r>
+    </w:p>
+    <w:p>
+      <w:r>
+        <w:drawing>
+          <wp:inline xmlns:a="http://schemas.openxmlformats.org/drawingml/2006/main" xmlns:pic="http://schemas.openxmlformats.org/drawingml/2006/picture">
+            <wp:extent cx="5852160" cy="1287475"/>
+            <wp:docPr id="4" name="Picture 4"/>
+            <wp:cNvGraphicFramePr>
+              <a:graphicFrameLocks noChangeAspect="1"/>
+            </wp:cNvGraphicFramePr>
+            <a:graphic>
+              <a:graphicData uri="http://schemas.openxmlformats.org/drawingml/2006/picture">
+                <pic:pic>
+                  <pic:nvPicPr>
+                    <pic:cNvPr id="0" name="fases_jobs.png"/>
+                    <pic:cNvPicPr/>
+                  </pic:nvPicPr>
+                  <pic:blipFill>
+                    <a:blip r:embed="rId12"/>
+                    <a:stretch>
+                      <a:fillRect/>
+                    </a:stretch>
+                  </pic:blipFill>
+                  <pic:spPr>
+                    <a:xfrm>
+                      <a:off x="0" y="0"/>
+                      <a:ext cx="5852160" cy="1287475"/>
+                    </a:xfrm>
+                    <a:prstGeom prst="rect"/>
+                  </pic:spPr>
+                </pic:pic>
+              </a:graphicData>
+            </a:graphic>
+          </wp:inline>
+        </w:drawing>
+      </w:r>
+    </w:p>
+    <w:p>
       <w:pPr>
         <w:pStyle w:val="Heading1"/>
       </w:pPr>
       <w:r>
-        <w:t>4. Guia de utilizacao</w:t>
+        <w:t>4. Fluxos de negocio</w:t>
+      </w:r>
+    </w:p>
+    <w:p>
+      <w:r>
+        <w:t>Fluxo A - Avaliacao multimodal:</w:t>
+      </w:r>
+    </w:p>
+    <w:p>
+      <w:pPr>
+        <w:pStyle w:val="ListNumber"/>
+      </w:pPr>
+      <w:r>
+        <w:t>Receber entrada multimodal.</w:t>
+      </w:r>
+    </w:p>
+    <w:p>
+      <w:pPr>
+        <w:pStyle w:val="ListNumber"/>
+      </w:pPr>
+      <w:r>
+        <w:t>Extrair e consolidar contexto.</w:t>
+      </w:r>
+    </w:p>
+    <w:p>
+      <w:pPr>
+        <w:pStyle w:val="ListNumber"/>
+      </w:pPr>
+      <w:r>
+        <w:t>Executar inferencia local/GPT.</w:t>
+      </w:r>
+    </w:p>
+    <w:p>
+      <w:pPr>
+        <w:pStyle w:val="ListNumber"/>
+      </w:pPr>
+      <w:r>
+        <w:t>Persistir resultado estruturado.</w:t>
+      </w:r>
+    </w:p>
+    <w:p>
+      <w:pPr>
+        <w:pStyle w:val="ListNumber"/>
+      </w:pPr>
+      <w:r>
+        <w:t>Exibir score e recomendacoes.</w:t>
+      </w:r>
+    </w:p>
+    <w:p>
+      <w:r>
+        <w:t>Fluxo B - Video IA:</w:t>
+      </w:r>
+    </w:p>
+    <w:p>
+      <w:pPr>
+        <w:pStyle w:val="ListNumber"/>
+      </w:pPr>
+      <w:r>
+        <w:t>Selecionar modo (auto/did_only/local_only).</w:t>
+      </w:r>
+    </w:p>
+    <w:p>
+      <w:pPr>
+        <w:pStyle w:val="ListNumber"/>
+      </w:pPr>
+      <w:r>
+        <w:t>Criar job assincromo.</w:t>
+      </w:r>
+    </w:p>
+    <w:p>
+      <w:pPr>
+        <w:pStyle w:val="ListNumber"/>
+      </w:pPr>
+      <w:r>
+        <w:t>Acompanhar progresso por endpoint.</w:t>
+      </w:r>
+    </w:p>
+    <w:p>
+      <w:pPr>
+        <w:pStyle w:val="ListNumber"/>
+      </w:pPr>
+      <w:r>
+        <w:t>Persistir artefato e metadata.</w:t>
+      </w:r>
+    </w:p>
+    <w:p>
+      <w:r>
+        <w:t>Fluxo C - Pitch deck PDF:</w:t>
+      </w:r>
+    </w:p>
+    <w:p>
+      <w:pPr>
+        <w:pStyle w:val="ListNumber"/>
+      </w:pPr>
+      <w:r>
+        <w:t>Construir narrativa do pitch.</w:t>
+      </w:r>
+    </w:p>
+    <w:p>
+      <w:pPr>
+        <w:pStyle w:val="ListNumber"/>
+      </w:pPr>
+      <w:r>
+        <w:t>Selecionar modo de design (automatico/manual).</w:t>
+      </w:r>
+    </w:p>
+    <w:p>
+      <w:pPr>
+        <w:pStyle w:val="ListNumber"/>
+      </w:pPr>
+      <w:r>
+        <w:t>Renderizar slides visuais.</w:t>
+      </w:r>
+    </w:p>
+    <w:p>
+      <w:pPr>
+        <w:pStyle w:val="ListNumber"/>
+      </w:pPr>
+      <w:r>
+        <w:t>Entregar PDF para download.</w:t>
+      </w:r>
+    </w:p>
+    <w:p>
+      <w:pPr>
+        <w:pStyle w:val="Heading1"/>
+      </w:pPr>
+      <w:r>
+        <w:t>5. Endpoints principais</w:t>
+      </w:r>
+    </w:p>
+    <w:tbl>
+      <w:tblPr>
+        <w:tblStyle w:val="LightList-Accent1"/>
+        <w:tblW w:type="auto" w:w="0"/>
+        <w:tblLook w:firstColumn="1" w:firstRow="1" w:lastColumn="0" w:lastRow="0" w:noHBand="0" w:noVBand="1" w:val="04A0"/>
+      </w:tblPr>
+      <w:tblGrid>
+        <w:gridCol w:w="2880"/>
+        <w:gridCol w:w="2880"/>
+        <w:gridCol w:w="2880"/>
+      </w:tblGrid>
+      <w:tr>
+        <w:tc>
+          <w:tcPr>
+            <w:tcW w:type="dxa" w:w="2880"/>
+          </w:tcPr>
+          <w:p>
+            <w:r>
+              <w:t>Endpoint</w:t>
+            </w:r>
+          </w:p>
+        </w:tc>
+        <w:tc>
+          <w:tcPr>
+            <w:tcW w:type="dxa" w:w="2880"/>
+          </w:tcPr>
+          <w:p>
+            <w:r>
+              <w:t>Metodo</w:t>
+            </w:r>
+          </w:p>
+        </w:tc>
+        <w:tc>
+          <w:tcPr>
+            <w:tcW w:type="dxa" w:w="2880"/>
+          </w:tcPr>
+          <w:p>
+            <w:r>
+              <w:t>Descricao</w:t>
+            </w:r>
+          </w:p>
+        </w:tc>
+      </w:tr>
+      <w:tr>
+        <w:tc>
+          <w:tcPr>
+            <w:tcW w:type="dxa" w:w="2880"/>
+          </w:tcPr>
+          <w:p>
+            <w:r>
+              <w:t>/analyze/form/</w:t>
+            </w:r>
+          </w:p>
+        </w:tc>
+        <w:tc>
+          <w:tcPr>
+            <w:tcW w:type="dxa" w:w="2880"/>
+          </w:tcPr>
+          <w:p>
+            <w:r>
+              <w:t>GET/POST</w:t>
+            </w:r>
+          </w:p>
+        </w:tc>
+        <w:tc>
+          <w:tcPr>
+            <w:tcW w:type="dxa" w:w="2880"/>
+          </w:tcPr>
+          <w:p>
+            <w:r>
+              <w:t>Formulario de avaliacao multimodal</w:t>
+            </w:r>
+          </w:p>
+        </w:tc>
+      </w:tr>
+      <w:tr>
+        <w:tc>
+          <w:tcPr>
+            <w:tcW w:type="dxa" w:w="2880"/>
+          </w:tcPr>
+          <w:p>
+            <w:r>
+              <w:t>/results/&lt;id&gt;/</w:t>
+            </w:r>
+          </w:p>
+        </w:tc>
+        <w:tc>
+          <w:tcPr>
+            <w:tcW w:type="dxa" w:w="2880"/>
+          </w:tcPr>
+          <w:p>
+            <w:r>
+              <w:t>GET</w:t>
+            </w:r>
+          </w:p>
+        </w:tc>
+        <w:tc>
+          <w:tcPr>
+            <w:tcW w:type="dxa" w:w="2880"/>
+          </w:tcPr>
+          <w:p>
+            <w:r>
+              <w:t>Resultado completo da analise</w:t>
+            </w:r>
+          </w:p>
+        </w:tc>
+      </w:tr>
+      <w:tr>
+        <w:tc>
+          <w:tcPr>
+            <w:tcW w:type="dxa" w:w="2880"/>
+          </w:tcPr>
+          <w:p>
+            <w:r>
+              <w:t>/results/&lt;id&gt;/pdf/</w:t>
+            </w:r>
+          </w:p>
+        </w:tc>
+        <w:tc>
+          <w:tcPr>
+            <w:tcW w:type="dxa" w:w="2880"/>
+          </w:tcPr>
+          <w:p>
+            <w:r>
+              <w:t>GET</w:t>
+            </w:r>
+          </w:p>
+        </w:tc>
+        <w:tc>
+          <w:tcPr>
+            <w:tcW w:type="dxa" w:w="2880"/>
+          </w:tcPr>
+          <w:p>
+            <w:r>
+              <w:t>Relatorio tecnico da analise</w:t>
+            </w:r>
+          </w:p>
+        </w:tc>
+      </w:tr>
+      <w:tr>
+        <w:tc>
+          <w:tcPr>
+            <w:tcW w:type="dxa" w:w="2880"/>
+          </w:tcPr>
+          <w:p>
+            <w:r>
+              <w:t>/results/&lt;id&gt;/pitch/pdf/</w:t>
+            </w:r>
+          </w:p>
+        </w:tc>
+        <w:tc>
+          <w:tcPr>
+            <w:tcW w:type="dxa" w:w="2880"/>
+          </w:tcPr>
+          <w:p>
+            <w:r>
+              <w:t>GET</w:t>
+            </w:r>
+          </w:p>
+        </w:tc>
+        <w:tc>
+          <w:tcPr>
+            <w:tcW w:type="dxa" w:w="2880"/>
+          </w:tcPr>
+          <w:p>
+            <w:r>
+              <w:t>Pitch deck visual</w:t>
+            </w:r>
+          </w:p>
+        </w:tc>
+      </w:tr>
+      <w:tr>
+        <w:tc>
+          <w:tcPr>
+            <w:tcW w:type="dxa" w:w="2880"/>
+          </w:tcPr>
+          <w:p>
+            <w:r>
+              <w:t>/results/&lt;id&gt;/video/generate/</w:t>
+            </w:r>
+          </w:p>
+        </w:tc>
+        <w:tc>
+          <w:tcPr>
+            <w:tcW w:type="dxa" w:w="2880"/>
+          </w:tcPr>
+          <w:p>
+            <w:r>
+              <w:t>POST</w:t>
+            </w:r>
+          </w:p>
+        </w:tc>
+        <w:tc>
+          <w:tcPr>
+            <w:tcW w:type="dxa" w:w="2880"/>
+          </w:tcPr>
+          <w:p>
+            <w:r>
+              <w:t>Inicia geracao de video</w:t>
+            </w:r>
+          </w:p>
+        </w:tc>
+      </w:tr>
+      <w:tr>
+        <w:tc>
+          <w:tcPr>
+            <w:tcW w:type="dxa" w:w="2880"/>
+          </w:tcPr>
+          <w:p>
+            <w:r>
+              <w:t>/results/&lt;id&gt;/video/progress/&lt;job_id&gt;/</w:t>
+            </w:r>
+          </w:p>
+        </w:tc>
+        <w:tc>
+          <w:tcPr>
+            <w:tcW w:type="dxa" w:w="2880"/>
+          </w:tcPr>
+          <w:p>
+            <w:r>
+              <w:t>GET</w:t>
+            </w:r>
+          </w:p>
+        </w:tc>
+        <w:tc>
+          <w:tcPr>
+            <w:tcW w:type="dxa" w:w="2880"/>
+          </w:tcPr>
+          <w:p>
+            <w:r>
+              <w:t>Progresso do video</w:t>
+            </w:r>
+          </w:p>
+        </w:tc>
+      </w:tr>
+      <w:tr>
+        <w:tc>
+          <w:tcPr>
+            <w:tcW w:type="dxa" w:w="2880"/>
+          </w:tcPr>
+          <w:p>
+            <w:r>
+              <w:t>/models/</w:t>
+            </w:r>
+          </w:p>
+        </w:tc>
+        <w:tc>
+          <w:tcPr>
+            <w:tcW w:type="dxa" w:w="2880"/>
+          </w:tcPr>
+          <w:p>
+            <w:r>
+              <w:t>GET/POST</w:t>
+            </w:r>
+          </w:p>
+        </w:tc>
+        <w:tc>
+          <w:tcPr>
+            <w:tcW w:type="dxa" w:w="2880"/>
+          </w:tcPr>
+          <w:p>
+            <w:r>
+              <w:t>Gestao e treino de modelos</w:t>
+            </w:r>
+          </w:p>
+        </w:tc>
+      </w:tr>
+      <w:tr>
+        <w:tc>
+          <w:tcPr>
+            <w:tcW w:type="dxa" w:w="2880"/>
+          </w:tcPr>
+          <w:p>
+            <w:r>
+              <w:t>/investors/</w:t>
+            </w:r>
+          </w:p>
+        </w:tc>
+        <w:tc>
+          <w:tcPr>
+            <w:tcW w:type="dxa" w:w="2880"/>
+          </w:tcPr>
+          <w:p>
+            <w:r>
+              <w:t>GET</w:t>
+            </w:r>
+          </w:p>
+        </w:tc>
+        <w:tc>
+          <w:tcPr>
+            <w:tcW w:type="dxa" w:w="2880"/>
+          </w:tcPr>
+          <w:p>
+            <w:r>
+              <w:t>Dashboard investidor</w:t>
+            </w:r>
+          </w:p>
+        </w:tc>
+      </w:tr>
+    </w:tbl>
+    <w:p>
+      <w:pPr>
+        <w:pStyle w:val="Heading1"/>
+      </w:pPr>
+      <w:r>
+        <w:t>6. Guia de utilizacao</w:t>
       </w:r>
     </w:p>
     <w:p>
@@ -302,7 +1046,7 @@
         <w:pStyle w:val="ListNumber"/>
       </w:pPr>
       <w:r>
-        <w:t>Gerar relatorio PDF tecnico da analise.</w:t>
+        <w:t>Gerar relatorio PDF tecnico.</w:t>
       </w:r>
     </w:p>
     <w:p>
@@ -310,7 +1054,15 @@
         <w:pStyle w:val="ListNumber"/>
       </w:pPr>
       <w:r>
-        <w:t>Gerar pitch PDF com design automatico ou premium manual.</w:t>
+        <w:t>Gerar pitch PDF em design automatico por contexto.</w:t>
+      </w:r>
+    </w:p>
+    <w:p>
+      <w:pPr>
+        <w:pStyle w:val="ListNumber"/>
+      </w:pPr>
+      <w:r>
+        <w:t>Gerar pitch PDF em design premium manual (template escolhido).</w:t>
       </w:r>
     </w:p>
     <w:p>
@@ -318,7 +1070,7 @@
         <w:pStyle w:val="Heading1"/>
       </w:pPr>
       <w:r>
-        <w:t>5. Operacao e validacao</w:t>
+        <w:t>7. Operacao, testes e troubleshooting</w:t>
       </w:r>
     </w:p>
     <w:p>
@@ -354,11 +1106,85 @@
       </w:r>
     </w:p>
     <w:p>
+      <w:r>
+        <w:t>Checklist funcional minimo:</w:t>
+      </w:r>
+    </w:p>
+    <w:p>
+      <w:pPr>
+        <w:pStyle w:val="ListBullet"/>
+      </w:pPr>
+      <w:r>
+        <w:t>Submissao multimodal valida.</w:t>
+      </w:r>
+    </w:p>
+    <w:p>
+      <w:pPr>
+        <w:pStyle w:val="ListBullet"/>
+      </w:pPr>
+      <w:r>
+        <w:t>Score e categorias no resultado.</w:t>
+      </w:r>
+    </w:p>
+    <w:p>
+      <w:pPr>
+        <w:pStyle w:val="ListBullet"/>
+      </w:pPr>
+      <w:r>
+        <w:t>Video IA com barra de progresso.</w:t>
+      </w:r>
+    </w:p>
+    <w:p>
+      <w:pPr>
+        <w:pStyle w:val="ListBullet"/>
+      </w:pPr>
+      <w:r>
+        <w:t>Pitch PDF com os dois modos de design.</w:t>
+      </w:r>
+    </w:p>
+    <w:p>
+      <w:pPr>
+        <w:pStyle w:val="ListBullet"/>
+      </w:pPr>
+      <w:r>
+        <w:t>Download de relatorio tecnico.</w:t>
+      </w:r>
+    </w:p>
+    <w:p>
+      <w:r>
+        <w:t>Troubleshooting rapido:</w:t>
+      </w:r>
+    </w:p>
+    <w:p>
+      <w:pPr>
+        <w:pStyle w:val="ListBullet"/>
+      </w:pPr>
+      <w:r>
+        <w:t>Falha D-ID: validar chave, creditos e URL HTTPS da imagem.</w:t>
+      </w:r>
+    </w:p>
+    <w:p>
+      <w:pPr>
+        <w:pStyle w:val="ListBullet"/>
+      </w:pPr>
+      <w:r>
+        <w:t>Falha GPT: validar OPENAI_API_KEY e fallback local.</w:t>
+      </w:r>
+    </w:p>
+    <w:p>
+      <w:pPr>
+        <w:pStyle w:val="ListBullet"/>
+      </w:pPr>
+      <w:r>
+        <w:t>Falha PDF/DOCX: validar dependencias e permissao de escrita.</w:t>
+      </w:r>
+    </w:p>
+    <w:p>
       <w:pPr>
         <w:pStyle w:val="Heading1"/>
       </w:pPr>
       <w:r>
-        <w:t>6. Publicacao de documentacao</w:t>
+        <w:t>8. Publicacao de documentacao</w:t>
       </w:r>
     </w:p>
     <w:p>

</xml_diff>